<commit_message>
final edits to critique
</commit_message>
<xml_diff>
--- a/deliverables/ENGR820 Critique 2 Tozzi.docx
+++ b/deliverables/ENGR820 Critique 2 Tozzi.docx
@@ -618,7 +618,25 @@
           <w:sz w:val="22"/>
           <w:szCs w:val="22"/>
         </w:rPr>
-        <w:t>ing key notes and citations in an effort to pack</w:t>
+        <w:t xml:space="preserve">ing key notes and citations </w:t>
+      </w:r>
+      <w:proofErr w:type="gramStart"/>
+      <w:r>
+        <w:rPr>
+          <w:rFonts w:ascii="Optima" w:hAnsi="Optima"/>
+          <w:sz w:val="22"/>
+          <w:szCs w:val="22"/>
+        </w:rPr>
+        <w:t>in an effort to</w:t>
+      </w:r>
+      <w:proofErr w:type="gramEnd"/>
+      <w:r>
+        <w:rPr>
+          <w:rFonts w:ascii="Optima" w:hAnsi="Optima"/>
+          <w:sz w:val="22"/>
+          <w:szCs w:val="22"/>
+        </w:rPr>
+        <w:t xml:space="preserve"> pack</w:t>
       </w:r>
       <w:r>
         <w:rPr>
@@ -1024,7 +1042,25 @@
           <w:sz w:val="22"/>
           <w:lang w:val="it-IT"/>
         </w:rPr>
-        <w:t xml:space="preserve">un, Y., Bottou, L., Bengio, Y., &amp; Haffner, P. (1998). </w:t>
+        <w:t xml:space="preserve">un, Y., </w:t>
+      </w:r>
+      <w:proofErr w:type="spellStart"/>
+      <w:r>
+        <w:rPr>
+          <w:rFonts w:ascii="Optima" w:hAnsi="Optima"/>
+          <w:sz w:val="22"/>
+          <w:lang w:val="it-IT"/>
+        </w:rPr>
+        <w:t>Bottou</w:t>
+      </w:r>
+      <w:proofErr w:type="spellEnd"/>
+      <w:r>
+        <w:rPr>
+          <w:rFonts w:ascii="Optima" w:hAnsi="Optima"/>
+          <w:sz w:val="22"/>
+          <w:lang w:val="it-IT"/>
+        </w:rPr>
+        <w:t xml:space="preserve">, L., Bengio, Y., &amp; Haffner, P. (1998). </w:t>
       </w:r>
       <w:r>
         <w:rPr>
@@ -1239,125 +1275,6 @@
     <w:pPr>
       <w:pStyle w:val="Header"/>
     </w:pPr>
-    <w:r>
-      <w:rPr>
-        <w:noProof/>
-      </w:rPr>
-      <mc:AlternateContent>
-        <mc:Choice Requires="wps">
-          <w:drawing>
-            <wp:anchor distT="0" distB="0" distL="0" distR="0" simplePos="0" relativeHeight="251659264" behindDoc="0" locked="0" layoutInCell="1" allowOverlap="1" wp14:anchorId="23645947" wp14:editId="34E09288">
-              <wp:simplePos x="635" y="635"/>
-              <wp:positionH relativeFrom="page">
-                <wp:align>center</wp:align>
-              </wp:positionH>
-              <wp:positionV relativeFrom="page">
-                <wp:align>top</wp:align>
-              </wp:positionV>
-              <wp:extent cx="1172845" cy="345440"/>
-              <wp:effectExtent l="0" t="0" r="8255" b="10160"/>
-              <wp:wrapNone/>
-              <wp:docPr id="427060181" name="Text Box 3" descr="NATO UNCLASSIFIED">
-                <a:extLst xmlns:a="http://schemas.openxmlformats.org/drawingml/2006/main">
-                  <a:ext uri="{5AE41FA2-C0FF-4470-9BD4-5FADCA87CBE2}">
-                    <aclsh:classification xmlns:aclsh="http://schemas.microsoft.com/office/drawing/2020/classificationShape" classificationOutcomeType="hdr"/>
-                  </a:ext>
-                </a:extLst>
-              </wp:docPr>
-              <wp:cNvGraphicFramePr/>
-              <a:graphic xmlns:a="http://schemas.openxmlformats.org/drawingml/2006/main">
-                <a:graphicData uri="http://schemas.microsoft.com/office/word/2010/wordprocessingShape">
-                  <wps:wsp>
-                    <wps:cNvSpPr txBox="1"/>
-                    <wps:spPr>
-                      <a:xfrm>
-                        <a:off x="0" y="0"/>
-                        <a:ext cx="1172845" cy="345440"/>
-                      </a:xfrm>
-                      <a:prstGeom prst="rect">
-                        <a:avLst/>
-                      </a:prstGeom>
-                      <a:noFill/>
-                      <a:ln>
-                        <a:noFill/>
-                      </a:ln>
-                    </wps:spPr>
-                    <wps:txbx>
-                      <w:txbxContent>
-                        <w:p>
-                          <w:pPr>
-                            <w:rPr>
-                              <w:rFonts w:ascii="Aptos" w:eastAsia="Aptos" w:hAnsi="Aptos" w:cs="Aptos"/>
-                              <w:noProof/>
-                              <w:color w:val="000000"/>
-                              <w:sz w:val="20"/>
-                              <w:szCs w:val="20"/>
-                            </w:rPr>
-                          </w:pPr>
-                          <w:r>
-                            <w:rPr>
-                              <w:rFonts w:ascii="Aptos" w:eastAsia="Aptos" w:hAnsi="Aptos" w:cs="Aptos"/>
-                              <w:noProof/>
-                              <w:color w:val="000000"/>
-                              <w:sz w:val="20"/>
-                              <w:szCs w:val="20"/>
-                            </w:rPr>
-                            <w:t>NATO UNCLASSIFIED</w:t>
-                          </w:r>
-                        </w:p>
-                      </w:txbxContent>
-                    </wps:txbx>
-                    <wps:bodyPr rot="0" spcFirstLastPara="0" vertOverflow="overflow" horzOverflow="overflow" vert="horz" wrap="none" lIns="0" tIns="190500" rIns="0" bIns="0" numCol="1" spcCol="0" rtlCol="0" fromWordArt="0" anchor="t" anchorCtr="0" forceAA="0" compatLnSpc="1">
-                      <a:prstTxWarp prst="textNoShape">
-                        <a:avLst/>
-                      </a:prstTxWarp>
-                      <a:spAutoFit/>
-                    </wps:bodyPr>
-                  </wps:wsp>
-                </a:graphicData>
-              </a:graphic>
-            </wp:anchor>
-          </w:drawing>
-        </mc:Choice>
-        <mc:Fallback>
-          <w:pict>
-            <v:shapetype w14:anchorId="23645947" id="_x0000_t202" coordsize="21600,21600" o:spt="202" path="m,l,21600r21600,l21600,xe">
-              <v:stroke joinstyle="miter"/>
-              <v:path gradientshapeok="t" o:connecttype="rect"/>
-            </v:shapetype>
-            <v:shape id="Text Box 3" o:spid="_x0000_s1026" type="#_x0000_t202" alt="NATO UNCLASSIFIED" style="position:absolute;margin-left:0;margin-top:0;width:92.35pt;height:27.2pt;z-index:251659264;visibility:visible;mso-wrap-style:none;mso-wrap-distance-left:0;mso-wrap-distance-top:0;mso-wrap-distance-right:0;mso-wrap-distance-bottom:0;mso-position-horizontal:center;mso-position-horizontal-relative:page;mso-position-vertical:top;mso-position-vertical-relative:page;v-text-anchor:top" o:gfxdata="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" filled="f" stroked="f">
-              <v:fill o:detectmouseclick="t"/>
-              <v:textbox style="mso-fit-shape-to-text:t" inset="0,15pt,0,0">
-                <w:txbxContent>
-                  <w:p>
-                    <w:pPr>
-                      <w:rPr>
-                        <w:rFonts w:ascii="Aptos" w:eastAsia="Aptos" w:hAnsi="Aptos" w:cs="Aptos"/>
-                        <w:noProof/>
-                        <w:color w:val="000000"/>
-                        <w:sz w:val="20"/>
-                        <w:szCs w:val="20"/>
-                      </w:rPr>
-                    </w:pPr>
-                    <w:r>
-                      <w:rPr>
-                        <w:rFonts w:ascii="Aptos" w:eastAsia="Aptos" w:hAnsi="Aptos" w:cs="Aptos"/>
-                        <w:noProof/>
-                        <w:color w:val="000000"/>
-                        <w:sz w:val="20"/>
-                        <w:szCs w:val="20"/>
-                      </w:rPr>
-                      <w:t>NATO UNCLASSIFIED</w:t>
-                    </w:r>
-                  </w:p>
-                </w:txbxContent>
-              </v:textbox>
-              <w10:wrap anchorx="page" anchory="page"/>
-            </v:shape>
-          </w:pict>
-        </mc:Fallback>
-      </mc:AlternateContent>
-    </w:r>
   </w:p>
 </w:hdr>
 </file>
@@ -1371,126 +1288,6 @@
         <w:rFonts w:ascii="Optima" w:hAnsi="Optima"/>
       </w:rPr>
     </w:pPr>
-    <w:r>
-      <w:rPr>
-        <w:rFonts w:ascii="Optima" w:hAnsi="Optima"/>
-        <w:noProof/>
-      </w:rPr>
-      <mc:AlternateContent>
-        <mc:Choice Requires="wps">
-          <w:drawing>
-            <wp:anchor distT="0" distB="0" distL="0" distR="0" simplePos="0" relativeHeight="251660288" behindDoc="0" locked="0" layoutInCell="1" allowOverlap="1" wp14:anchorId="3FD077A7" wp14:editId="7DDD38F0">
-              <wp:simplePos x="0" y="0"/>
-              <wp:positionH relativeFrom="page">
-                <wp:align>center</wp:align>
-              </wp:positionH>
-              <wp:positionV relativeFrom="page">
-                <wp:align>top</wp:align>
-              </wp:positionV>
-              <wp:extent cx="1172845" cy="345440"/>
-              <wp:effectExtent l="0" t="0" r="8255" b="10160"/>
-              <wp:wrapNone/>
-              <wp:docPr id="717355231" name="Text Box 4" descr="NATO UNCLASSIFIED">
-                <a:extLst xmlns:a="http://schemas.openxmlformats.org/drawingml/2006/main">
-                  <a:ext uri="{5AE41FA2-C0FF-4470-9BD4-5FADCA87CBE2}">
-                    <aclsh:classification xmlns:aclsh="http://schemas.microsoft.com/office/drawing/2020/classificationShape" classificationOutcomeType="hdr"/>
-                  </a:ext>
-                </a:extLst>
-              </wp:docPr>
-              <wp:cNvGraphicFramePr/>
-              <a:graphic xmlns:a="http://schemas.openxmlformats.org/drawingml/2006/main">
-                <a:graphicData uri="http://schemas.microsoft.com/office/word/2010/wordprocessingShape">
-                  <wps:wsp>
-                    <wps:cNvSpPr txBox="1"/>
-                    <wps:spPr>
-                      <a:xfrm>
-                        <a:off x="0" y="0"/>
-                        <a:ext cx="1172845" cy="345440"/>
-                      </a:xfrm>
-                      <a:prstGeom prst="rect">
-                        <a:avLst/>
-                      </a:prstGeom>
-                      <a:noFill/>
-                      <a:ln>
-                        <a:noFill/>
-                      </a:ln>
-                    </wps:spPr>
-                    <wps:txbx>
-                      <w:txbxContent>
-                        <w:p>
-                          <w:pPr>
-                            <w:rPr>
-                              <w:rFonts w:ascii="Aptos" w:eastAsia="Aptos" w:hAnsi="Aptos" w:cs="Aptos"/>
-                              <w:noProof/>
-                              <w:color w:val="000000"/>
-                              <w:sz w:val="20"/>
-                              <w:szCs w:val="20"/>
-                            </w:rPr>
-                          </w:pPr>
-                          <w:r>
-                            <w:rPr>
-                              <w:rFonts w:ascii="Aptos" w:eastAsia="Aptos" w:hAnsi="Aptos" w:cs="Aptos"/>
-                              <w:noProof/>
-                              <w:color w:val="000000"/>
-                              <w:sz w:val="20"/>
-                              <w:szCs w:val="20"/>
-                            </w:rPr>
-                            <w:t>NATO UNCLASSIFIED</w:t>
-                          </w:r>
-                        </w:p>
-                      </w:txbxContent>
-                    </wps:txbx>
-                    <wps:bodyPr rot="0" spcFirstLastPara="0" vertOverflow="overflow" horzOverflow="overflow" vert="horz" wrap="none" lIns="0" tIns="190500" rIns="0" bIns="0" numCol="1" spcCol="0" rtlCol="0" fromWordArt="0" anchor="t" anchorCtr="0" forceAA="0" compatLnSpc="1">
-                      <a:prstTxWarp prst="textNoShape">
-                        <a:avLst/>
-                      </a:prstTxWarp>
-                      <a:spAutoFit/>
-                    </wps:bodyPr>
-                  </wps:wsp>
-                </a:graphicData>
-              </a:graphic>
-            </wp:anchor>
-          </w:drawing>
-        </mc:Choice>
-        <mc:Fallback>
-          <w:pict>
-            <v:shapetype w14:anchorId="3FD077A7" id="_x0000_t202" coordsize="21600,21600" o:spt="202" path="m,l,21600r21600,l21600,xe">
-              <v:stroke joinstyle="miter"/>
-              <v:path gradientshapeok="t" o:connecttype="rect"/>
-            </v:shapetype>
-            <v:shape id="Text Box 4" o:spid="_x0000_s1027" type="#_x0000_t202" alt="NATO UNCLASSIFIED" style="position:absolute;margin-left:0;margin-top:0;width:92.35pt;height:27.2pt;z-index:251660288;visibility:visible;mso-wrap-style:none;mso-wrap-distance-left:0;mso-wrap-distance-top:0;mso-wrap-distance-right:0;mso-wrap-distance-bottom:0;mso-position-horizontal:center;mso-position-horizontal-relative:page;mso-position-vertical:top;mso-position-vertical-relative:page;v-text-anchor:top" o:gfxdata="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" filled="f" stroked="f">
-              <v:fill o:detectmouseclick="t"/>
-              <v:textbox style="mso-fit-shape-to-text:t" inset="0,15pt,0,0">
-                <w:txbxContent>
-                  <w:p>
-                    <w:pPr>
-                      <w:rPr>
-                        <w:rFonts w:ascii="Aptos" w:eastAsia="Aptos" w:hAnsi="Aptos" w:cs="Aptos"/>
-                        <w:noProof/>
-                        <w:color w:val="000000"/>
-                        <w:sz w:val="20"/>
-                        <w:szCs w:val="20"/>
-                      </w:rPr>
-                    </w:pPr>
-                    <w:r>
-                      <w:rPr>
-                        <w:rFonts w:ascii="Aptos" w:eastAsia="Aptos" w:hAnsi="Aptos" w:cs="Aptos"/>
-                        <w:noProof/>
-                        <w:color w:val="000000"/>
-                        <w:sz w:val="20"/>
-                        <w:szCs w:val="20"/>
-                      </w:rPr>
-                      <w:t>NATO UNCLASSIFIED</w:t>
-                    </w:r>
-                  </w:p>
-                </w:txbxContent>
-              </v:textbox>
-              <w10:wrap anchorx="page" anchory="page"/>
-            </v:shape>
-          </w:pict>
-        </mc:Fallback>
-      </mc:AlternateContent>
-    </w:r>
     <w:r>
       <w:rPr>
         <w:rFonts w:ascii="Optima" w:hAnsi="Optima"/>
@@ -1552,125 +1349,6 @@
     <w:pPr>
       <w:pStyle w:val="Header"/>
     </w:pPr>
-    <w:r>
-      <w:rPr>
-        <w:noProof/>
-      </w:rPr>
-      <mc:AlternateContent>
-        <mc:Choice Requires="wps">
-          <w:drawing>
-            <wp:anchor distT="0" distB="0" distL="0" distR="0" simplePos="0" relativeHeight="251658240" behindDoc="0" locked="0" layoutInCell="1" allowOverlap="1" wp14:anchorId="0B0937E2" wp14:editId="01876B68">
-              <wp:simplePos x="635" y="635"/>
-              <wp:positionH relativeFrom="page">
-                <wp:align>center</wp:align>
-              </wp:positionH>
-              <wp:positionV relativeFrom="page">
-                <wp:align>top</wp:align>
-              </wp:positionV>
-              <wp:extent cx="1172845" cy="345440"/>
-              <wp:effectExtent l="0" t="0" r="8255" b="10160"/>
-              <wp:wrapNone/>
-              <wp:docPr id="1967408270" name="Text Box 2" descr="NATO UNCLASSIFIED">
-                <a:extLst xmlns:a="http://schemas.openxmlformats.org/drawingml/2006/main">
-                  <a:ext uri="{5AE41FA2-C0FF-4470-9BD4-5FADCA87CBE2}">
-                    <aclsh:classification xmlns:aclsh="http://schemas.microsoft.com/office/drawing/2020/classificationShape" classificationOutcomeType="hdr"/>
-                  </a:ext>
-                </a:extLst>
-              </wp:docPr>
-              <wp:cNvGraphicFramePr/>
-              <a:graphic xmlns:a="http://schemas.openxmlformats.org/drawingml/2006/main">
-                <a:graphicData uri="http://schemas.microsoft.com/office/word/2010/wordprocessingShape">
-                  <wps:wsp>
-                    <wps:cNvSpPr txBox="1"/>
-                    <wps:spPr>
-                      <a:xfrm>
-                        <a:off x="0" y="0"/>
-                        <a:ext cx="1172845" cy="345440"/>
-                      </a:xfrm>
-                      <a:prstGeom prst="rect">
-                        <a:avLst/>
-                      </a:prstGeom>
-                      <a:noFill/>
-                      <a:ln>
-                        <a:noFill/>
-                      </a:ln>
-                    </wps:spPr>
-                    <wps:txbx>
-                      <w:txbxContent>
-                        <w:p>
-                          <w:pPr>
-                            <w:rPr>
-                              <w:rFonts w:ascii="Aptos" w:eastAsia="Aptos" w:hAnsi="Aptos" w:cs="Aptos"/>
-                              <w:noProof/>
-                              <w:color w:val="000000"/>
-                              <w:sz w:val="20"/>
-                              <w:szCs w:val="20"/>
-                            </w:rPr>
-                          </w:pPr>
-                          <w:r>
-                            <w:rPr>
-                              <w:rFonts w:ascii="Aptos" w:eastAsia="Aptos" w:hAnsi="Aptos" w:cs="Aptos"/>
-                              <w:noProof/>
-                              <w:color w:val="000000"/>
-                              <w:sz w:val="20"/>
-                              <w:szCs w:val="20"/>
-                            </w:rPr>
-                            <w:t>NATO UNCLASSIFIED</w:t>
-                          </w:r>
-                        </w:p>
-                      </w:txbxContent>
-                    </wps:txbx>
-                    <wps:bodyPr rot="0" spcFirstLastPara="0" vertOverflow="overflow" horzOverflow="overflow" vert="horz" wrap="none" lIns="0" tIns="190500" rIns="0" bIns="0" numCol="1" spcCol="0" rtlCol="0" fromWordArt="0" anchor="t" anchorCtr="0" forceAA="0" compatLnSpc="1">
-                      <a:prstTxWarp prst="textNoShape">
-                        <a:avLst/>
-                      </a:prstTxWarp>
-                      <a:spAutoFit/>
-                    </wps:bodyPr>
-                  </wps:wsp>
-                </a:graphicData>
-              </a:graphic>
-            </wp:anchor>
-          </w:drawing>
-        </mc:Choice>
-        <mc:Fallback>
-          <w:pict>
-            <v:shapetype w14:anchorId="0B0937E2" id="_x0000_t202" coordsize="21600,21600" o:spt="202" path="m,l,21600r21600,l21600,xe">
-              <v:stroke joinstyle="miter"/>
-              <v:path gradientshapeok="t" o:connecttype="rect"/>
-            </v:shapetype>
-            <v:shape id="Text Box 2" o:spid="_x0000_s1028" type="#_x0000_t202" alt="NATO UNCLASSIFIED" style="position:absolute;margin-left:0;margin-top:0;width:92.35pt;height:27.2pt;z-index:251658240;visibility:visible;mso-wrap-style:none;mso-wrap-distance-left:0;mso-wrap-distance-top:0;mso-wrap-distance-right:0;mso-wrap-distance-bottom:0;mso-position-horizontal:center;mso-position-horizontal-relative:page;mso-position-vertical:top;mso-position-vertical-relative:page;v-text-anchor:top" o:gfxdata="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" filled="f" stroked="f">
-              <v:fill o:detectmouseclick="t"/>
-              <v:textbox style="mso-fit-shape-to-text:t" inset="0,15pt,0,0">
-                <w:txbxContent>
-                  <w:p>
-                    <w:pPr>
-                      <w:rPr>
-                        <w:rFonts w:ascii="Aptos" w:eastAsia="Aptos" w:hAnsi="Aptos" w:cs="Aptos"/>
-                        <w:noProof/>
-                        <w:color w:val="000000"/>
-                        <w:sz w:val="20"/>
-                        <w:szCs w:val="20"/>
-                      </w:rPr>
-                    </w:pPr>
-                    <w:r>
-                      <w:rPr>
-                        <w:rFonts w:ascii="Aptos" w:eastAsia="Aptos" w:hAnsi="Aptos" w:cs="Aptos"/>
-                        <w:noProof/>
-                        <w:color w:val="000000"/>
-                        <w:sz w:val="20"/>
-                        <w:szCs w:val="20"/>
-                      </w:rPr>
-                      <w:t>NATO UNCLASSIFIED</w:t>
-                    </w:r>
-                  </w:p>
-                </w:txbxContent>
-              </v:textbox>
-              <w10:wrap anchorx="page" anchory="page"/>
-            </v:shape>
-          </w:pict>
-        </mc:Fallback>
-      </mc:AlternateContent>
-    </w:r>
   </w:p>
 </w:hdr>
 </file>

</xml_diff>